<commit_message>
v4.0: Apply tool-directed refinements: resolve PDE4B paradox via Arnsten inverted-U cAMP, regularize zero-variance floor, remove quantum decoherence homology, and recompile all formats
</commit_message>
<xml_diff>
--- a/papers/docx/2_collection_index.docx
+++ b/papers/docx/2_collection_index.docx
@@ -327,13 +327,7 @@
         <w:t xml:space="preserve"> </w:t>
       </w:r>
       <w:r>
-        <w:t xml:space="preserve">it, and no overclaiming anywhere a theory of trust is concerned. The essay makes</w:t>
-      </w:r>
-      <w:r>
-        <w:t xml:space="preserve"> </w:t>
-      </w:r>
-      <w:r>
-        <w:t xml:space="preserve">no empirical claims and reports no data.</w:t>
+        <w:t xml:space="preserve">it, and no overclaiming anywhere a theory of trust is concerned. The essay serves as the philosophical and personal anchor of the collection, establishing the ethical and epistemic commitments of the program without reporting quantitative data.</w:t>
       </w:r>
     </w:p>
     <w:bookmarkEnd w:id="9"/>

</xml_diff>

<commit_message>
v4.1: Synchronize all paper formats, update collection index simulation table with Sim D19/G24, and recompile all PDFs and DOCX
</commit_message>
<xml_diff>
--- a/papers/docx/2_collection_index.docx
+++ b/papers/docx/2_collection_index.docx
@@ -745,6 +745,706 @@
             </w:pPr>
             <w:r>
               <w:t xml:space="preserve">GTT §4.6</w:t>
+            </w:r>
+          </w:p>
+        </w:tc>
+      </w:tr>
+      <w:tr>
+        <w:tc>
+          <w:tcPr/>
+          <w:p>
+            <w:pPr>
+              <w:pStyle w:val="Compact"/>
+              <w:jc w:val="left"/>
+            </w:pPr>
+            <w:r>
+              <w:t xml:space="preserve">Sim L (L1 / L2 / L3)</w:t>
+            </w:r>
+          </w:p>
+        </w:tc>
+        <w:tc>
+          <w:tcPr/>
+          <w:p>
+            <w:pPr>
+              <w:pStyle w:val="Compact"/>
+              <w:jc w:val="left"/>
+            </w:pPr>
+            <w:r>
+              <w:t xml:space="preserve">1,024-cell bioelectric lattice</w:t>
+            </w:r>
+          </w:p>
+        </w:tc>
+        <w:tc>
+          <w:tcPr/>
+          <w:p>
+            <w:pPr>
+              <w:pStyle w:val="Compact"/>
+              <w:jc w:val="left"/>
+            </w:pPr>
+            <w:r>
+              <w:t xml:space="preserve">FAIL / PASS / PASS</w:t>
+            </w:r>
+          </w:p>
+        </w:tc>
+        <w:tc>
+          <w:tcPr/>
+          <w:p>
+            <w:pPr>
+              <w:pStyle w:val="Compact"/>
+              <w:jc w:val="left"/>
+            </w:pPr>
+            <w:r>
+              <w:t xml:space="preserve">DOCAS §5.10</w:t>
+            </w:r>
+          </w:p>
+        </w:tc>
+      </w:tr>
+      <w:tr>
+        <w:tc>
+          <w:tcPr/>
+          <w:p>
+            <w:pPr>
+              <w:pStyle w:val="Compact"/>
+              <w:jc w:val="left"/>
+            </w:pPr>
+            <w:r>
+              <w:t xml:space="preserve">Sim D17 (C1–C4)</w:t>
+            </w:r>
+          </w:p>
+        </w:tc>
+        <w:tc>
+          <w:tcPr/>
+          <w:p>
+            <w:pPr>
+              <w:pStyle w:val="Compact"/>
+              <w:jc w:val="left"/>
+            </w:pPr>
+            <w:r>
+              <w:t xml:space="preserve">1,000 agents, thermal weather</w:t>
+            </w:r>
+          </w:p>
+        </w:tc>
+        <w:tc>
+          <w:tcPr/>
+          <w:p>
+            <w:pPr>
+              <w:pStyle w:val="Compact"/>
+              <w:jc w:val="left"/>
+            </w:pPr>
+            <w:r>
+              <w:t xml:space="preserve">FAIL as frozen (0/4)</w:t>
+            </w:r>
+          </w:p>
+        </w:tc>
+        <w:tc>
+          <w:tcPr/>
+          <w:p>
+            <w:pPr>
+              <w:pStyle w:val="Compact"/>
+              <w:jc w:val="left"/>
+            </w:pPr>
+            <w:r>
+              <w:t xml:space="preserve">DOCAS §5.11</w:t>
+            </w:r>
+          </w:p>
+        </w:tc>
+      </w:tr>
+      <w:tr>
+        <w:tc>
+          <w:tcPr/>
+          <w:p>
+            <w:pPr>
+              <w:pStyle w:val="Compact"/>
+              <w:jc w:val="left"/>
+            </w:pPr>
+            <w:r>
+              <w:t xml:space="preserve">Sim D18 (C1–C4)</w:t>
+            </w:r>
+          </w:p>
+        </w:tc>
+        <w:tc>
+          <w:tcPr/>
+          <w:p>
+            <w:pPr>
+              <w:pStyle w:val="Compact"/>
+              <w:jc w:val="left"/>
+            </w:pPr>
+            <w:r>
+              <w:t xml:space="preserve">1,000 agents, Baylor unconscious</w:t>
+            </w:r>
+          </w:p>
+        </w:tc>
+        <w:tc>
+          <w:tcPr/>
+          <w:p>
+            <w:pPr>
+              <w:pStyle w:val="Compact"/>
+              <w:jc w:val="left"/>
+            </w:pPr>
+            <w:r>
+              <w:t xml:space="preserve">FAIL as frozen (2/4)</w:t>
+            </w:r>
+          </w:p>
+        </w:tc>
+        <w:tc>
+          <w:tcPr/>
+          <w:p>
+            <w:pPr>
+              <w:pStyle w:val="Compact"/>
+              <w:jc w:val="left"/>
+            </w:pPr>
+            <w:r>
+              <w:t xml:space="preserve">DOCAS §5.12</w:t>
+            </w:r>
+          </w:p>
+        </w:tc>
+      </w:tr>
+      <w:tr>
+        <w:tc>
+          <w:tcPr/>
+          <w:p>
+            <w:pPr>
+              <w:pStyle w:val="Compact"/>
+              <w:jc w:val="left"/>
+            </w:pPr>
+            <w:r>
+              <w:t xml:space="preserve">Sim D19 (C1–C4)</w:t>
+            </w:r>
+          </w:p>
+        </w:tc>
+        <w:tc>
+          <w:tcPr/>
+          <w:p>
+            <w:pPr>
+              <w:pStyle w:val="Compact"/>
+              <w:jc w:val="left"/>
+            </w:pPr>
+            <w:r>
+              <w:t xml:space="preserve">1,000 agents, Perky reality filter</w:t>
+            </w:r>
+          </w:p>
+        </w:tc>
+        <w:tc>
+          <w:tcPr/>
+          <w:p>
+            <w:pPr>
+              <w:pStyle w:val="Compact"/>
+              <w:jc w:val="left"/>
+            </w:pPr>
+            <w:r>
+              <w:t xml:space="preserve">FAIL as frozen (2/4)</w:t>
+            </w:r>
+          </w:p>
+        </w:tc>
+        <w:tc>
+          <w:tcPr/>
+          <w:p>
+            <w:pPr>
+              <w:pStyle w:val="Compact"/>
+              <w:jc w:val="left"/>
+            </w:pPr>
+            <w:r>
+              <w:t xml:space="preserve">DOCAS §5.13</w:t>
+            </w:r>
+          </w:p>
+        </w:tc>
+      </w:tr>
+      <w:tr>
+        <w:tc>
+          <w:tcPr/>
+          <w:p>
+            <w:pPr>
+              <w:pStyle w:val="Compact"/>
+              <w:jc w:val="left"/>
+            </w:pPr>
+            <w:r>
+              <w:t xml:space="preserve">Sim G24 (C1–C4)</w:t>
+            </w:r>
+          </w:p>
+        </w:tc>
+        <w:tc>
+          <w:tcPr/>
+          <w:p>
+            <w:pPr>
+              <w:pStyle w:val="Compact"/>
+              <w:jc w:val="left"/>
+            </w:pPr>
+            <w:r>
+              <w:t xml:space="preserve">1,000 microcircuits, AM missense</w:t>
+            </w:r>
+          </w:p>
+        </w:tc>
+        <w:tc>
+          <w:tcPr/>
+          <w:p>
+            <w:pPr>
+              <w:pStyle w:val="Compact"/>
+              <w:jc w:val="left"/>
+            </w:pPr>
+            <w:r>
+              <w:t xml:space="preserve">FAIL as frozen (0/4)</w:t>
+            </w:r>
+          </w:p>
+        </w:tc>
+        <w:tc>
+          <w:tcPr/>
+          <w:p>
+            <w:pPr>
+              <w:pStyle w:val="Compact"/>
+              <w:jc w:val="left"/>
+            </w:pPr>
+            <w:r>
+              <w:t xml:space="preserve">DOCAS §5.14</w:t>
+            </w:r>
+          </w:p>
+        </w:tc>
+      </w:tr>
+      <w:tr>
+        <w:tc>
+          <w:tcPr/>
+          <w:p>
+            <w:pPr>
+              <w:pStyle w:val="Compact"/>
+              <w:jc w:val="left"/>
+            </w:pPr>
+            <w:r>
+              <w:t xml:space="preserve">Sim M (C1–C4)</w:t>
+            </w:r>
+          </w:p>
+        </w:tc>
+        <w:tc>
+          <w:tcPr/>
+          <w:p>
+            <w:pPr>
+              <w:pStyle w:val="Compact"/>
+              <w:jc w:val="left"/>
+            </w:pPr>
+            <w:r>
+              <w:t xml:space="preserve">10,000 listening sessions</w:t>
+            </w:r>
+          </w:p>
+        </w:tc>
+        <w:tc>
+          <w:tcPr/>
+          <w:p>
+            <w:pPr>
+              <w:pStyle w:val="Compact"/>
+              <w:jc w:val="left"/>
+            </w:pPr>
+            <w:r>
+              <w:t xml:space="preserve">PASS (4/4)</w:t>
+            </w:r>
+          </w:p>
+        </w:tc>
+        <w:tc>
+          <w:tcPr/>
+          <w:p>
+            <w:pPr>
+              <w:pStyle w:val="Compact"/>
+              <w:jc w:val="left"/>
+            </w:pPr>
+            <w:r>
+              <w:t xml:space="preserve">DOCAS §5.15</w:t>
+            </w:r>
+          </w:p>
+        </w:tc>
+      </w:tr>
+      <w:tr>
+        <w:tc>
+          <w:tcPr/>
+          <w:p>
+            <w:pPr>
+              <w:pStyle w:val="Compact"/>
+              <w:jc w:val="left"/>
+            </w:pPr>
+            <w:r>
+              <w:t xml:space="preserve">Sim K (K1 / K2 / K3)</w:t>
+            </w:r>
+          </w:p>
+        </w:tc>
+        <w:tc>
+          <w:tcPr/>
+          <w:p>
+            <w:pPr>
+              <w:pStyle w:val="Compact"/>
+              <w:jc w:val="left"/>
+            </w:pPr>
+            <w:r>
+              <w:t xml:space="preserve">1,024 agents, 50 generations</w:t>
+            </w:r>
+          </w:p>
+        </w:tc>
+        <w:tc>
+          <w:tcPr/>
+          <w:p>
+            <w:pPr>
+              <w:pStyle w:val="Compact"/>
+              <w:jc w:val="left"/>
+            </w:pPr>
+            <w:r>
+              <w:t xml:space="preserve">FAIL / PASS / PASS</w:t>
+            </w:r>
+          </w:p>
+        </w:tc>
+        <w:tc>
+          <w:tcPr/>
+          <w:p>
+            <w:pPr>
+              <w:pStyle w:val="Compact"/>
+              <w:jc w:val="left"/>
+            </w:pPr>
+            <w:r>
+              <w:t xml:space="preserve">DOCAS §5.16</w:t>
+            </w:r>
+          </w:p>
+        </w:tc>
+      </w:tr>
+      <w:tr>
+        <w:tc>
+          <w:tcPr/>
+          <w:p>
+            <w:pPr>
+              <w:pStyle w:val="Compact"/>
+              <w:jc w:val="left"/>
+            </w:pPr>
+            <w:r>
+              <w:t xml:space="preserve">Sim C (C1 / C2 / C3)</w:t>
+            </w:r>
+          </w:p>
+        </w:tc>
+        <w:tc>
+          <w:tcPr/>
+          <w:p>
+            <w:pPr>
+              <w:pStyle w:val="Compact"/>
+              <w:jc w:val="left"/>
+            </w:pPr>
+            <w:r>
+              <w:t xml:space="preserve">1,000 present-biased agents</w:t>
+            </w:r>
+          </w:p>
+        </w:tc>
+        <w:tc>
+          <w:tcPr/>
+          <w:p>
+            <w:pPr>
+              <w:pStyle w:val="Compact"/>
+              <w:jc w:val="left"/>
+            </w:pPr>
+            <w:r>
+              <w:t xml:space="preserve">PASS (3/3)</w:t>
+            </w:r>
+          </w:p>
+        </w:tc>
+        <w:tc>
+          <w:tcPr/>
+          <w:p>
+            <w:pPr>
+              <w:pStyle w:val="Compact"/>
+              <w:jc w:val="left"/>
+            </w:pPr>
+            <w:r>
+              <w:t xml:space="preserve">DOCAS §5.17</w:t>
+            </w:r>
+          </w:p>
+        </w:tc>
+      </w:tr>
+      <w:tr>
+        <w:tc>
+          <w:tcPr/>
+          <w:p>
+            <w:pPr>
+              <w:pStyle w:val="Compact"/>
+              <w:jc w:val="left"/>
+            </w:pPr>
+            <w:r>
+              <w:t xml:space="preserve">Sim S (S1 / S2 / S3)</w:t>
+            </w:r>
+          </w:p>
+        </w:tc>
+        <w:tc>
+          <w:tcPr/>
+          <w:p>
+            <w:pPr>
+              <w:pStyle w:val="Compact"/>
+              <w:jc w:val="left"/>
+            </w:pPr>
+            <w:r>
+              <w:t xml:space="preserve">256 agents, 8D embedding</w:t>
+            </w:r>
+          </w:p>
+        </w:tc>
+        <w:tc>
+          <w:tcPr/>
+          <w:p>
+            <w:pPr>
+              <w:pStyle w:val="Compact"/>
+              <w:jc w:val="left"/>
+            </w:pPr>
+            <w:r>
+              <w:t xml:space="preserve">PASS (3/3)</w:t>
+            </w:r>
+          </w:p>
+        </w:tc>
+        <w:tc>
+          <w:tcPr/>
+          <w:p>
+            <w:pPr>
+              <w:pStyle w:val="Compact"/>
+              <w:jc w:val="left"/>
+            </w:pPr>
+            <w:r>
+              <w:t xml:space="preserve">DOCAS §5.18</w:t>
+            </w:r>
+          </w:p>
+        </w:tc>
+      </w:tr>
+      <w:tr>
+        <w:tc>
+          <w:tcPr/>
+          <w:p>
+            <w:pPr>
+              <w:pStyle w:val="Compact"/>
+              <w:jc w:val="left"/>
+            </w:pPr>
+            <w:r>
+              <w:t xml:space="preserve">Sim DMN (DMN-1–3)</w:t>
+            </w:r>
+          </w:p>
+        </w:tc>
+        <w:tc>
+          <w:tcPr/>
+          <w:p>
+            <w:pPr>
+              <w:pStyle w:val="Compact"/>
+              <w:jc w:val="left"/>
+            </w:pPr>
+            <w:r>
+              <w:t xml:space="preserve">1,000 agents, K in [1..10]</w:t>
+            </w:r>
+          </w:p>
+        </w:tc>
+        <w:tc>
+          <w:tcPr/>
+          <w:p>
+            <w:pPr>
+              <w:pStyle w:val="Compact"/>
+              <w:jc w:val="left"/>
+            </w:pPr>
+            <w:r>
+              <w:t xml:space="preserve">FAIL / PASS / PASS</w:t>
+            </w:r>
+          </w:p>
+        </w:tc>
+        <w:tc>
+          <w:tcPr/>
+          <w:p>
+            <w:pPr>
+              <w:pStyle w:val="Compact"/>
+              <w:jc w:val="left"/>
+            </w:pPr>
+            <w:r>
+              <w:t xml:space="preserve">DOCAS §5.19</w:t>
+            </w:r>
+          </w:p>
+        </w:tc>
+      </w:tr>
+      <w:tr>
+        <w:tc>
+          <w:tcPr/>
+          <w:p>
+            <w:pPr>
+              <w:pStyle w:val="Compact"/>
+              <w:jc w:val="left"/>
+            </w:pPr>
+            <w:r>
+              <w:t xml:space="preserve">Sim CRIT (CRIT-1–3)</w:t>
+            </w:r>
+          </w:p>
+        </w:tc>
+        <w:tc>
+          <w:tcPr/>
+          <w:p>
+            <w:pPr>
+              <w:pStyle w:val="Compact"/>
+              <w:jc w:val="left"/>
+            </w:pPr>
+            <w:r>
+              <w:t xml:space="preserve">1,024 nodes, branching</w:t>
+            </w:r>
+          </w:p>
+        </w:tc>
+        <w:tc>
+          <w:tcPr/>
+          <w:p>
+            <w:pPr>
+              <w:pStyle w:val="Compact"/>
+              <w:jc w:val="left"/>
+            </w:pPr>
+            <w:r>
+              <w:t xml:space="preserve">FAIL / PASS / PASS</w:t>
+            </w:r>
+          </w:p>
+        </w:tc>
+        <w:tc>
+          <w:tcPr/>
+          <w:p>
+            <w:pPr>
+              <w:pStyle w:val="Compact"/>
+              <w:jc w:val="left"/>
+            </w:pPr>
+            <w:r>
+              <w:t xml:space="preserve">DOCAS §5.20</w:t>
+            </w:r>
+          </w:p>
+        </w:tc>
+      </w:tr>
+      <w:tr>
+        <w:tc>
+          <w:tcPr/>
+          <w:p>
+            <w:pPr>
+              <w:pStyle w:val="Compact"/>
+              <w:jc w:val="left"/>
+            </w:pPr>
+            <w:r>
+              <w:t xml:space="preserve">Sim B (B1 / B2 / B3)</w:t>
+            </w:r>
+          </w:p>
+        </w:tc>
+        <w:tc>
+          <w:tcPr/>
+          <w:p>
+            <w:pPr>
+              <w:pStyle w:val="Compact"/>
+              <w:jc w:val="left"/>
+            </w:pPr>
+            <w:r>
+              <w:t xml:space="preserve">512 non-neural cells, maze</w:t>
+            </w:r>
+          </w:p>
+        </w:tc>
+        <w:tc>
+          <w:tcPr/>
+          <w:p>
+            <w:pPr>
+              <w:pStyle w:val="Compact"/>
+              <w:jc w:val="left"/>
+            </w:pPr>
+            <w:r>
+              <w:t xml:space="preserve">PASS (3/3)</w:t>
+            </w:r>
+          </w:p>
+        </w:tc>
+        <w:tc>
+          <w:tcPr/>
+          <w:p>
+            <w:pPr>
+              <w:pStyle w:val="Compact"/>
+              <w:jc w:val="left"/>
+            </w:pPr>
+            <w:r>
+              <w:t xml:space="preserve">DOCAS §5.21</w:t>
+            </w:r>
+          </w:p>
+        </w:tc>
+      </w:tr>
+      <w:tr>
+        <w:tc>
+          <w:tcPr/>
+          <w:p>
+            <w:pPr>
+              <w:pStyle w:val="Compact"/>
+              <w:jc w:val="left"/>
+            </w:pPr>
+            <w:r>
+              <w:t xml:space="preserve">Sim X (X1 / X2 / X3)</w:t>
+            </w:r>
+          </w:p>
+        </w:tc>
+        <w:tc>
+          <w:tcPr/>
+          <w:p>
+            <w:pPr>
+              <w:pStyle w:val="Compact"/>
+              <w:jc w:val="left"/>
+            </w:pPr>
+            <w:r>
+              <w:t xml:space="preserve">4 substrates, Cell to Human</w:t>
+            </w:r>
+          </w:p>
+        </w:tc>
+        <w:tc>
+          <w:tcPr/>
+          <w:p>
+            <w:pPr>
+              <w:pStyle w:val="Compact"/>
+              <w:jc w:val="left"/>
+            </w:pPr>
+            <w:r>
+              <w:t xml:space="preserve">PASS (3/3)</w:t>
+            </w:r>
+          </w:p>
+        </w:tc>
+        <w:tc>
+          <w:tcPr/>
+          <w:p>
+            <w:pPr>
+              <w:pStyle w:val="Compact"/>
+              <w:jc w:val="left"/>
+            </w:pPr>
+            <w:r>
+              <w:t xml:space="preserve">DOCAS §5.22</w:t>
+            </w:r>
+          </w:p>
+        </w:tc>
+      </w:tr>
+      <w:tr>
+        <w:tc>
+          <w:tcPr/>
+          <w:p>
+            <w:pPr>
+              <w:pStyle w:val="Compact"/>
+              <w:jc w:val="left"/>
+            </w:pPr>
+            <w:r>
+              <w:t xml:space="preserve">Sim META (META-1–3)</w:t>
+            </w:r>
+          </w:p>
+        </w:tc>
+        <w:tc>
+          <w:tcPr/>
+          <w:p>
+            <w:pPr>
+              <w:pStyle w:val="Compact"/>
+              <w:jc w:val="left"/>
+            </w:pPr>
+            <w:r>
+              <w:t xml:space="preserve">Universal cross-scale vector</w:t>
+            </w:r>
+          </w:p>
+        </w:tc>
+        <w:tc>
+          <w:tcPr/>
+          <w:p>
+            <w:pPr>
+              <w:pStyle w:val="Compact"/>
+              <w:jc w:val="left"/>
+            </w:pPr>
+            <w:r>
+              <w:t xml:space="preserve">FAIL / PASS / PASS</w:t>
+            </w:r>
+          </w:p>
+        </w:tc>
+        <w:tc>
+          <w:tcPr/>
+          <w:p>
+            <w:pPr>
+              <w:pStyle w:val="Compact"/>
+              <w:jc w:val="left"/>
+            </w:pPr>
+            <w:r>
+              <w:t xml:space="preserve">DOCAS §5.23</w:t>
             </w:r>
           </w:p>
         </w:tc>

</xml_diff>

<commit_message>
v4.1: Integrate Sim D20 and Sim D21 into DOCAS manuscript, update collection index, and recompile all PDFs and DOCX
</commit_message>
<xml_diff>
--- a/papers/docx/2_collection_index.docx
+++ b/papers/docx/2_collection_index.docx
@@ -1008,31 +1008,31 @@
               <w:jc w:val="left"/>
             </w:pPr>
             <w:r>
-              <w:t xml:space="preserve">Sim M (C1–C4)</w:t>
-            </w:r>
-          </w:p>
-        </w:tc>
-        <w:tc>
-          <w:tcPr/>
-          <w:p>
-            <w:pPr>
-              <w:pStyle w:val="Compact"/>
-              <w:jc w:val="left"/>
-            </w:pPr>
-            <w:r>
-              <w:t xml:space="preserve">10,000 listening sessions</w:t>
-            </w:r>
-          </w:p>
-        </w:tc>
-        <w:tc>
-          <w:tcPr/>
-          <w:p>
-            <w:pPr>
-              <w:pStyle w:val="Compact"/>
-              <w:jc w:val="left"/>
-            </w:pPr>
-            <w:r>
-              <w:t xml:space="preserve">PASS (4/4)</w:t>
+              <w:t xml:space="preserve">Sim D20 (C1–C4)</w:t>
+            </w:r>
+          </w:p>
+        </w:tc>
+        <w:tc>
+          <w:tcPr/>
+          <w:p>
+            <w:pPr>
+              <w:pStyle w:val="Compact"/>
+              <w:jc w:val="left"/>
+            </w:pPr>
+            <w:r>
+              <w:t xml:space="preserve">1,000 agents, fast-talking audio</w:t>
+            </w:r>
+          </w:p>
+        </w:tc>
+        <w:tc>
+          <w:tcPr/>
+          <w:p>
+            <w:pPr>
+              <w:pStyle w:val="Compact"/>
+              <w:jc w:val="left"/>
+            </w:pPr>
+            <w:r>
+              <w:t xml:space="preserve">FAIL as frozen (3/4)</w:t>
             </w:r>
           </w:p>
         </w:tc>
@@ -1058,31 +1058,31 @@
               <w:jc w:val="left"/>
             </w:pPr>
             <w:r>
-              <w:t xml:space="preserve">Sim K (K1 / K2 / K3)</w:t>
-            </w:r>
-          </w:p>
-        </w:tc>
-        <w:tc>
-          <w:tcPr/>
-          <w:p>
-            <w:pPr>
-              <w:pStyle w:val="Compact"/>
-              <w:jc w:val="left"/>
-            </w:pPr>
-            <w:r>
-              <w:t xml:space="preserve">1,024 agents, 50 generations</w:t>
-            </w:r>
-          </w:p>
-        </w:tc>
-        <w:tc>
-          <w:tcPr/>
-          <w:p>
-            <w:pPr>
-              <w:pStyle w:val="Compact"/>
-              <w:jc w:val="left"/>
-            </w:pPr>
-            <w:r>
-              <w:t xml:space="preserve">FAIL / PASS / PASS</w:t>
+              <w:t xml:space="preserve">Sim D21 (C1–C4)</w:t>
+            </w:r>
+          </w:p>
+        </w:tc>
+        <w:tc>
+          <w:tcPr/>
+          <w:p>
+            <w:pPr>
+              <w:pStyle w:val="Compact"/>
+              <w:jc w:val="left"/>
+            </w:pPr>
+            <w:r>
+              <w:t xml:space="preserve">27 stimuli, multimodal TRIBE v2</w:t>
+            </w:r>
+          </w:p>
+        </w:tc>
+        <w:tc>
+          <w:tcPr/>
+          <w:p>
+            <w:pPr>
+              <w:pStyle w:val="Compact"/>
+              <w:jc w:val="left"/>
+            </w:pPr>
+            <w:r>
+              <w:t xml:space="preserve">FAIL as frozen (2/4)</w:t>
             </w:r>
           </w:p>
         </w:tc>
@@ -1108,31 +1108,31 @@
               <w:jc w:val="left"/>
             </w:pPr>
             <w:r>
-              <w:t xml:space="preserve">Sim C (C1 / C2 / C3)</w:t>
-            </w:r>
-          </w:p>
-        </w:tc>
-        <w:tc>
-          <w:tcPr/>
-          <w:p>
-            <w:pPr>
-              <w:pStyle w:val="Compact"/>
-              <w:jc w:val="left"/>
-            </w:pPr>
-            <w:r>
-              <w:t xml:space="preserve">1,000 present-biased agents</w:t>
-            </w:r>
-          </w:p>
-        </w:tc>
-        <w:tc>
-          <w:tcPr/>
-          <w:p>
-            <w:pPr>
-              <w:pStyle w:val="Compact"/>
-              <w:jc w:val="left"/>
-            </w:pPr>
-            <w:r>
-              <w:t xml:space="preserve">PASS (3/3)</w:t>
+              <w:t xml:space="preserve">Sim M (C1–C4)</w:t>
+            </w:r>
+          </w:p>
+        </w:tc>
+        <w:tc>
+          <w:tcPr/>
+          <w:p>
+            <w:pPr>
+              <w:pStyle w:val="Compact"/>
+              <w:jc w:val="left"/>
+            </w:pPr>
+            <w:r>
+              <w:t xml:space="preserve">10,000 listening sessions</w:t>
+            </w:r>
+          </w:p>
+        </w:tc>
+        <w:tc>
+          <w:tcPr/>
+          <w:p>
+            <w:pPr>
+              <w:pStyle w:val="Compact"/>
+              <w:jc w:val="left"/>
+            </w:pPr>
+            <w:r>
+              <w:t xml:space="preserve">PASS (4/4)</w:t>
             </w:r>
           </w:p>
         </w:tc>
@@ -1158,31 +1158,31 @@
               <w:jc w:val="left"/>
             </w:pPr>
             <w:r>
-              <w:t xml:space="preserve">Sim S (S1 / S2 / S3)</w:t>
-            </w:r>
-          </w:p>
-        </w:tc>
-        <w:tc>
-          <w:tcPr/>
-          <w:p>
-            <w:pPr>
-              <w:pStyle w:val="Compact"/>
-              <w:jc w:val="left"/>
-            </w:pPr>
-            <w:r>
-              <w:t xml:space="preserve">256 agents, 8D embedding</w:t>
-            </w:r>
-          </w:p>
-        </w:tc>
-        <w:tc>
-          <w:tcPr/>
-          <w:p>
-            <w:pPr>
-              <w:pStyle w:val="Compact"/>
-              <w:jc w:val="left"/>
-            </w:pPr>
-            <w:r>
-              <w:t xml:space="preserve">PASS (3/3)</w:t>
+              <w:t xml:space="preserve">Sim K (K1 / K2 / K3)</w:t>
+            </w:r>
+          </w:p>
+        </w:tc>
+        <w:tc>
+          <w:tcPr/>
+          <w:p>
+            <w:pPr>
+              <w:pStyle w:val="Compact"/>
+              <w:jc w:val="left"/>
+            </w:pPr>
+            <w:r>
+              <w:t xml:space="preserve">1,024 agents, 50 generations</w:t>
+            </w:r>
+          </w:p>
+        </w:tc>
+        <w:tc>
+          <w:tcPr/>
+          <w:p>
+            <w:pPr>
+              <w:pStyle w:val="Compact"/>
+              <w:jc w:val="left"/>
+            </w:pPr>
+            <w:r>
+              <w:t xml:space="preserve">FAIL / PASS / PASS</w:t>
             </w:r>
           </w:p>
         </w:tc>
@@ -1208,31 +1208,31 @@
               <w:jc w:val="left"/>
             </w:pPr>
             <w:r>
-              <w:t xml:space="preserve">Sim DMN (DMN-1–3)</w:t>
-            </w:r>
-          </w:p>
-        </w:tc>
-        <w:tc>
-          <w:tcPr/>
-          <w:p>
-            <w:pPr>
-              <w:pStyle w:val="Compact"/>
-              <w:jc w:val="left"/>
-            </w:pPr>
-            <w:r>
-              <w:t xml:space="preserve">1,000 agents, K in [1..10]</w:t>
-            </w:r>
-          </w:p>
-        </w:tc>
-        <w:tc>
-          <w:tcPr/>
-          <w:p>
-            <w:pPr>
-              <w:pStyle w:val="Compact"/>
-              <w:jc w:val="left"/>
-            </w:pPr>
-            <w:r>
-              <w:t xml:space="preserve">FAIL / PASS / PASS</w:t>
+              <w:t xml:space="preserve">Sim C (C1 / C2 / C3)</w:t>
+            </w:r>
+          </w:p>
+        </w:tc>
+        <w:tc>
+          <w:tcPr/>
+          <w:p>
+            <w:pPr>
+              <w:pStyle w:val="Compact"/>
+              <w:jc w:val="left"/>
+            </w:pPr>
+            <w:r>
+              <w:t xml:space="preserve">1,000 present-biased agents</w:t>
+            </w:r>
+          </w:p>
+        </w:tc>
+        <w:tc>
+          <w:tcPr/>
+          <w:p>
+            <w:pPr>
+              <w:pStyle w:val="Compact"/>
+              <w:jc w:val="left"/>
+            </w:pPr>
+            <w:r>
+              <w:t xml:space="preserve">PASS (3/3)</w:t>
             </w:r>
           </w:p>
         </w:tc>
@@ -1258,31 +1258,31 @@
               <w:jc w:val="left"/>
             </w:pPr>
             <w:r>
-              <w:t xml:space="preserve">Sim CRIT (CRIT-1–3)</w:t>
-            </w:r>
-          </w:p>
-        </w:tc>
-        <w:tc>
-          <w:tcPr/>
-          <w:p>
-            <w:pPr>
-              <w:pStyle w:val="Compact"/>
-              <w:jc w:val="left"/>
-            </w:pPr>
-            <w:r>
-              <w:t xml:space="preserve">1,024 nodes, branching</w:t>
-            </w:r>
-          </w:p>
-        </w:tc>
-        <w:tc>
-          <w:tcPr/>
-          <w:p>
-            <w:pPr>
-              <w:pStyle w:val="Compact"/>
-              <w:jc w:val="left"/>
-            </w:pPr>
-            <w:r>
-              <w:t xml:space="preserve">FAIL / PASS / PASS</w:t>
+              <w:t xml:space="preserve">Sim S (S1 / S2 / S3)</w:t>
+            </w:r>
+          </w:p>
+        </w:tc>
+        <w:tc>
+          <w:tcPr/>
+          <w:p>
+            <w:pPr>
+              <w:pStyle w:val="Compact"/>
+              <w:jc w:val="left"/>
+            </w:pPr>
+            <w:r>
+              <w:t xml:space="preserve">256 agents, 8D embedding</w:t>
+            </w:r>
+          </w:p>
+        </w:tc>
+        <w:tc>
+          <w:tcPr/>
+          <w:p>
+            <w:pPr>
+              <w:pStyle w:val="Compact"/>
+              <w:jc w:val="left"/>
+            </w:pPr>
+            <w:r>
+              <w:t xml:space="preserve">PASS (3/3)</w:t>
             </w:r>
           </w:p>
         </w:tc>
@@ -1308,31 +1308,31 @@
               <w:jc w:val="left"/>
             </w:pPr>
             <w:r>
-              <w:t xml:space="preserve">Sim B (B1 / B2 / B3)</w:t>
-            </w:r>
-          </w:p>
-        </w:tc>
-        <w:tc>
-          <w:tcPr/>
-          <w:p>
-            <w:pPr>
-              <w:pStyle w:val="Compact"/>
-              <w:jc w:val="left"/>
-            </w:pPr>
-            <w:r>
-              <w:t xml:space="preserve">512 non-neural cells, maze</w:t>
-            </w:r>
-          </w:p>
-        </w:tc>
-        <w:tc>
-          <w:tcPr/>
-          <w:p>
-            <w:pPr>
-              <w:pStyle w:val="Compact"/>
-              <w:jc w:val="left"/>
-            </w:pPr>
-            <w:r>
-              <w:t xml:space="preserve">PASS (3/3)</w:t>
+              <w:t xml:space="preserve">Sim DMN (DMN-1–3)</w:t>
+            </w:r>
+          </w:p>
+        </w:tc>
+        <w:tc>
+          <w:tcPr/>
+          <w:p>
+            <w:pPr>
+              <w:pStyle w:val="Compact"/>
+              <w:jc w:val="left"/>
+            </w:pPr>
+            <w:r>
+              <w:t xml:space="preserve">1,000 agents, K in [1..10]</w:t>
+            </w:r>
+          </w:p>
+        </w:tc>
+        <w:tc>
+          <w:tcPr/>
+          <w:p>
+            <w:pPr>
+              <w:pStyle w:val="Compact"/>
+              <w:jc w:val="left"/>
+            </w:pPr>
+            <w:r>
+              <w:t xml:space="preserve">FAIL / PASS / PASS</w:t>
             </w:r>
           </w:p>
         </w:tc>
@@ -1358,31 +1358,31 @@
               <w:jc w:val="left"/>
             </w:pPr>
             <w:r>
-              <w:t xml:space="preserve">Sim X (X1 / X2 / X3)</w:t>
-            </w:r>
-          </w:p>
-        </w:tc>
-        <w:tc>
-          <w:tcPr/>
-          <w:p>
-            <w:pPr>
-              <w:pStyle w:val="Compact"/>
-              <w:jc w:val="left"/>
-            </w:pPr>
-            <w:r>
-              <w:t xml:space="preserve">4 substrates, Cell to Human</w:t>
-            </w:r>
-          </w:p>
-        </w:tc>
-        <w:tc>
-          <w:tcPr/>
-          <w:p>
-            <w:pPr>
-              <w:pStyle w:val="Compact"/>
-              <w:jc w:val="left"/>
-            </w:pPr>
-            <w:r>
-              <w:t xml:space="preserve">PASS (3/3)</w:t>
+              <w:t xml:space="preserve">Sim CRIT (CRIT-1–3)</w:t>
+            </w:r>
+          </w:p>
+        </w:tc>
+        <w:tc>
+          <w:tcPr/>
+          <w:p>
+            <w:pPr>
+              <w:pStyle w:val="Compact"/>
+              <w:jc w:val="left"/>
+            </w:pPr>
+            <w:r>
+              <w:t xml:space="preserve">1,024 nodes, branching</w:t>
+            </w:r>
+          </w:p>
+        </w:tc>
+        <w:tc>
+          <w:tcPr/>
+          <w:p>
+            <w:pPr>
+              <w:pStyle w:val="Compact"/>
+              <w:jc w:val="left"/>
+            </w:pPr>
+            <w:r>
+              <w:t xml:space="preserve">FAIL / PASS / PASS</w:t>
             </w:r>
           </w:p>
         </w:tc>
@@ -1408,6 +1408,106 @@
               <w:jc w:val="left"/>
             </w:pPr>
             <w:r>
+              <w:t xml:space="preserve">Sim B (B1 / B2 / B3)</w:t>
+            </w:r>
+          </w:p>
+        </w:tc>
+        <w:tc>
+          <w:tcPr/>
+          <w:p>
+            <w:pPr>
+              <w:pStyle w:val="Compact"/>
+              <w:jc w:val="left"/>
+            </w:pPr>
+            <w:r>
+              <w:t xml:space="preserve">512 non-neural cells, maze</w:t>
+            </w:r>
+          </w:p>
+        </w:tc>
+        <w:tc>
+          <w:tcPr/>
+          <w:p>
+            <w:pPr>
+              <w:pStyle w:val="Compact"/>
+              <w:jc w:val="left"/>
+            </w:pPr>
+            <w:r>
+              <w:t xml:space="preserve">PASS (3/3)</w:t>
+            </w:r>
+          </w:p>
+        </w:tc>
+        <w:tc>
+          <w:tcPr/>
+          <w:p>
+            <w:pPr>
+              <w:pStyle w:val="Compact"/>
+              <w:jc w:val="left"/>
+            </w:pPr>
+            <w:r>
+              <w:t xml:space="preserve">DOCAS §5.23</w:t>
+            </w:r>
+          </w:p>
+        </w:tc>
+      </w:tr>
+      <w:tr>
+        <w:tc>
+          <w:tcPr/>
+          <w:p>
+            <w:pPr>
+              <w:pStyle w:val="Compact"/>
+              <w:jc w:val="left"/>
+            </w:pPr>
+            <w:r>
+              <w:t xml:space="preserve">Sim X (X1 / X2 / X3)</w:t>
+            </w:r>
+          </w:p>
+        </w:tc>
+        <w:tc>
+          <w:tcPr/>
+          <w:p>
+            <w:pPr>
+              <w:pStyle w:val="Compact"/>
+              <w:jc w:val="left"/>
+            </w:pPr>
+            <w:r>
+              <w:t xml:space="preserve">4 substrates, Cell to Human</w:t>
+            </w:r>
+          </w:p>
+        </w:tc>
+        <w:tc>
+          <w:tcPr/>
+          <w:p>
+            <w:pPr>
+              <w:pStyle w:val="Compact"/>
+              <w:jc w:val="left"/>
+            </w:pPr>
+            <w:r>
+              <w:t xml:space="preserve">PASS (3/3)</w:t>
+            </w:r>
+          </w:p>
+        </w:tc>
+        <w:tc>
+          <w:tcPr/>
+          <w:p>
+            <w:pPr>
+              <w:pStyle w:val="Compact"/>
+              <w:jc w:val="left"/>
+            </w:pPr>
+            <w:r>
+              <w:t xml:space="preserve">DOCAS §5.24</w:t>
+            </w:r>
+          </w:p>
+        </w:tc>
+      </w:tr>
+      <w:tr>
+        <w:tc>
+          <w:tcPr/>
+          <w:p>
+            <w:pPr>
+              <w:pStyle w:val="Compact"/>
+              <w:jc w:val="left"/>
+            </w:pPr>
+            <w:r>
               <w:t xml:space="preserve">Sim META (META-1–3)</w:t>
             </w:r>
           </w:p>
@@ -1444,7 +1544,7 @@
               <w:jc w:val="left"/>
             </w:pPr>
             <w:r>
-              <w:t xml:space="preserve">DOCAS §5.23</w:t>
+              <w:t xml:space="preserve">DOCAS §5.25</w:t>
             </w:r>
           </w:p>
         </w:tc>

</xml_diff>

<commit_message>
v4.1: Pre-register and execute Sim N (Non-Dualism) and Sim V (Vibrational Resonance), and recompile all paper formats
</commit_message>
<xml_diff>
--- a/papers/docx/2_collection_index.docx
+++ b/papers/docx/2_collection_index.docx
@@ -1108,31 +1108,31 @@
               <w:jc w:val="left"/>
             </w:pPr>
             <w:r>
-              <w:t xml:space="preserve">Sim M (C1–C4)</w:t>
-            </w:r>
-          </w:p>
-        </w:tc>
-        <w:tc>
-          <w:tcPr/>
-          <w:p>
-            <w:pPr>
-              <w:pStyle w:val="Compact"/>
-              <w:jc w:val="left"/>
-            </w:pPr>
-            <w:r>
-              <w:t xml:space="preserve">10,000 listening sessions</w:t>
-            </w:r>
-          </w:p>
-        </w:tc>
-        <w:tc>
-          <w:tcPr/>
-          <w:p>
-            <w:pPr>
-              <w:pStyle w:val="Compact"/>
-              <w:jc w:val="left"/>
-            </w:pPr>
-            <w:r>
-              <w:t xml:space="preserve">PASS (4/4)</w:t>
+              <w:t xml:space="preserve">Sim N (C1–C3)</w:t>
+            </w:r>
+          </w:p>
+        </w:tc>
+        <w:tc>
+          <w:tcPr/>
+          <w:p>
+            <w:pPr>
+              <w:pStyle w:val="Compact"/>
+              <w:jc w:val="left"/>
+            </w:pPr>
+            <w:r>
+              <w:t xml:space="preserve">1,000 agents, Markov blanket</w:t>
+            </w:r>
+          </w:p>
+        </w:tc>
+        <w:tc>
+          <w:tcPr/>
+          <w:p>
+            <w:pPr>
+              <w:pStyle w:val="Compact"/>
+              <w:jc w:val="left"/>
+            </w:pPr>
+            <w:r>
+              <w:t xml:space="preserve">FAIL as frozen (2/3)</w:t>
             </w:r>
           </w:p>
         </w:tc>
@@ -1158,31 +1158,31 @@
               <w:jc w:val="left"/>
             </w:pPr>
             <w:r>
-              <w:t xml:space="preserve">Sim K (K1 / K2 / K3)</w:t>
-            </w:r>
-          </w:p>
-        </w:tc>
-        <w:tc>
-          <w:tcPr/>
-          <w:p>
-            <w:pPr>
-              <w:pStyle w:val="Compact"/>
-              <w:jc w:val="left"/>
-            </w:pPr>
-            <w:r>
-              <w:t xml:space="preserve">1,024 agents, 50 generations</w:t>
-            </w:r>
-          </w:p>
-        </w:tc>
-        <w:tc>
-          <w:tcPr/>
-          <w:p>
-            <w:pPr>
-              <w:pStyle w:val="Compact"/>
-              <w:jc w:val="left"/>
-            </w:pPr>
-            <w:r>
-              <w:t xml:space="preserve">FAIL / PASS / PASS</w:t>
+              <w:t xml:space="preserve">Sim V (C1–C3)</w:t>
+            </w:r>
+          </w:p>
+        </w:tc>
+        <w:tc>
+          <w:tcPr/>
+          <w:p>
+            <w:pPr>
+              <w:pStyle w:val="Compact"/>
+              <w:jc w:val="left"/>
+            </w:pPr>
+            <w:r>
+              <w:t xml:space="preserve">1D harmonic oscillator, fatigue</w:t>
+            </w:r>
+          </w:p>
+        </w:tc>
+        <w:tc>
+          <w:tcPr/>
+          <w:p>
+            <w:pPr>
+              <w:pStyle w:val="Compact"/>
+              <w:jc w:val="left"/>
+            </w:pPr>
+            <w:r>
+              <w:t xml:space="preserve">FAIL as frozen (1/3)</w:t>
             </w:r>
           </w:p>
         </w:tc>
@@ -1208,31 +1208,31 @@
               <w:jc w:val="left"/>
             </w:pPr>
             <w:r>
-              <w:t xml:space="preserve">Sim C (C1 / C2 / C3)</w:t>
-            </w:r>
-          </w:p>
-        </w:tc>
-        <w:tc>
-          <w:tcPr/>
-          <w:p>
-            <w:pPr>
-              <w:pStyle w:val="Compact"/>
-              <w:jc w:val="left"/>
-            </w:pPr>
-            <w:r>
-              <w:t xml:space="preserve">1,000 present-biased agents</w:t>
-            </w:r>
-          </w:p>
-        </w:tc>
-        <w:tc>
-          <w:tcPr/>
-          <w:p>
-            <w:pPr>
-              <w:pStyle w:val="Compact"/>
-              <w:jc w:val="left"/>
-            </w:pPr>
-            <w:r>
-              <w:t xml:space="preserve">PASS (3/3)</w:t>
+              <w:t xml:space="preserve">Sim M (C1–C4)</w:t>
+            </w:r>
+          </w:p>
+        </w:tc>
+        <w:tc>
+          <w:tcPr/>
+          <w:p>
+            <w:pPr>
+              <w:pStyle w:val="Compact"/>
+              <w:jc w:val="left"/>
+            </w:pPr>
+            <w:r>
+              <w:t xml:space="preserve">10,000 listening sessions</w:t>
+            </w:r>
+          </w:p>
+        </w:tc>
+        <w:tc>
+          <w:tcPr/>
+          <w:p>
+            <w:pPr>
+              <w:pStyle w:val="Compact"/>
+              <w:jc w:val="left"/>
+            </w:pPr>
+            <w:r>
+              <w:t xml:space="preserve">PASS (4/4)</w:t>
             </w:r>
           </w:p>
         </w:tc>
@@ -1258,31 +1258,31 @@
               <w:jc w:val="left"/>
             </w:pPr>
             <w:r>
-              <w:t xml:space="preserve">Sim S (S1 / S2 / S3)</w:t>
-            </w:r>
-          </w:p>
-        </w:tc>
-        <w:tc>
-          <w:tcPr/>
-          <w:p>
-            <w:pPr>
-              <w:pStyle w:val="Compact"/>
-              <w:jc w:val="left"/>
-            </w:pPr>
-            <w:r>
-              <w:t xml:space="preserve">256 agents, 8D embedding</w:t>
-            </w:r>
-          </w:p>
-        </w:tc>
-        <w:tc>
-          <w:tcPr/>
-          <w:p>
-            <w:pPr>
-              <w:pStyle w:val="Compact"/>
-              <w:jc w:val="left"/>
-            </w:pPr>
-            <w:r>
-              <w:t xml:space="preserve">PASS (3/3)</w:t>
+              <w:t xml:space="preserve">Sim K (K1 / K2 / K3)</w:t>
+            </w:r>
+          </w:p>
+        </w:tc>
+        <w:tc>
+          <w:tcPr/>
+          <w:p>
+            <w:pPr>
+              <w:pStyle w:val="Compact"/>
+              <w:jc w:val="left"/>
+            </w:pPr>
+            <w:r>
+              <w:t xml:space="preserve">1,024 agents, 50 generations</w:t>
+            </w:r>
+          </w:p>
+        </w:tc>
+        <w:tc>
+          <w:tcPr/>
+          <w:p>
+            <w:pPr>
+              <w:pStyle w:val="Compact"/>
+              <w:jc w:val="left"/>
+            </w:pPr>
+            <w:r>
+              <w:t xml:space="preserve">FAIL / PASS / PASS</w:t>
             </w:r>
           </w:p>
         </w:tc>
@@ -1308,31 +1308,31 @@
               <w:jc w:val="left"/>
             </w:pPr>
             <w:r>
-              <w:t xml:space="preserve">Sim DMN (DMN-1–3)</w:t>
-            </w:r>
-          </w:p>
-        </w:tc>
-        <w:tc>
-          <w:tcPr/>
-          <w:p>
-            <w:pPr>
-              <w:pStyle w:val="Compact"/>
-              <w:jc w:val="left"/>
-            </w:pPr>
-            <w:r>
-              <w:t xml:space="preserve">1,000 agents, K in [1..10]</w:t>
-            </w:r>
-          </w:p>
-        </w:tc>
-        <w:tc>
-          <w:tcPr/>
-          <w:p>
-            <w:pPr>
-              <w:pStyle w:val="Compact"/>
-              <w:jc w:val="left"/>
-            </w:pPr>
-            <w:r>
-              <w:t xml:space="preserve">FAIL / PASS / PASS</w:t>
+              <w:t xml:space="preserve">Sim C (C1 / C2 / C3)</w:t>
+            </w:r>
+          </w:p>
+        </w:tc>
+        <w:tc>
+          <w:tcPr/>
+          <w:p>
+            <w:pPr>
+              <w:pStyle w:val="Compact"/>
+              <w:jc w:val="left"/>
+            </w:pPr>
+            <w:r>
+              <w:t xml:space="preserve">1,000 present-biased agents</w:t>
+            </w:r>
+          </w:p>
+        </w:tc>
+        <w:tc>
+          <w:tcPr/>
+          <w:p>
+            <w:pPr>
+              <w:pStyle w:val="Compact"/>
+              <w:jc w:val="left"/>
+            </w:pPr>
+            <w:r>
+              <w:t xml:space="preserve">PASS (3/3)</w:t>
             </w:r>
           </w:p>
         </w:tc>
@@ -1358,31 +1358,31 @@
               <w:jc w:val="left"/>
             </w:pPr>
             <w:r>
-              <w:t xml:space="preserve">Sim CRIT (CRIT-1–3)</w:t>
-            </w:r>
-          </w:p>
-        </w:tc>
-        <w:tc>
-          <w:tcPr/>
-          <w:p>
-            <w:pPr>
-              <w:pStyle w:val="Compact"/>
-              <w:jc w:val="left"/>
-            </w:pPr>
-            <w:r>
-              <w:t xml:space="preserve">1,024 nodes, branching</w:t>
-            </w:r>
-          </w:p>
-        </w:tc>
-        <w:tc>
-          <w:tcPr/>
-          <w:p>
-            <w:pPr>
-              <w:pStyle w:val="Compact"/>
-              <w:jc w:val="left"/>
-            </w:pPr>
-            <w:r>
-              <w:t xml:space="preserve">FAIL / PASS / PASS</w:t>
+              <w:t xml:space="preserve">Sim S (S1 / S2 / S3)</w:t>
+            </w:r>
+          </w:p>
+        </w:tc>
+        <w:tc>
+          <w:tcPr/>
+          <w:p>
+            <w:pPr>
+              <w:pStyle w:val="Compact"/>
+              <w:jc w:val="left"/>
+            </w:pPr>
+            <w:r>
+              <w:t xml:space="preserve">256 agents, 8D embedding</w:t>
+            </w:r>
+          </w:p>
+        </w:tc>
+        <w:tc>
+          <w:tcPr/>
+          <w:p>
+            <w:pPr>
+              <w:pStyle w:val="Compact"/>
+              <w:jc w:val="left"/>
+            </w:pPr>
+            <w:r>
+              <w:t xml:space="preserve">PASS (3/3)</w:t>
             </w:r>
           </w:p>
         </w:tc>
@@ -1408,31 +1408,31 @@
               <w:jc w:val="left"/>
             </w:pPr>
             <w:r>
-              <w:t xml:space="preserve">Sim B (B1 / B2 / B3)</w:t>
-            </w:r>
-          </w:p>
-        </w:tc>
-        <w:tc>
-          <w:tcPr/>
-          <w:p>
-            <w:pPr>
-              <w:pStyle w:val="Compact"/>
-              <w:jc w:val="left"/>
-            </w:pPr>
-            <w:r>
-              <w:t xml:space="preserve">512 non-neural cells, maze</w:t>
-            </w:r>
-          </w:p>
-        </w:tc>
-        <w:tc>
-          <w:tcPr/>
-          <w:p>
-            <w:pPr>
-              <w:pStyle w:val="Compact"/>
-              <w:jc w:val="left"/>
-            </w:pPr>
-            <w:r>
-              <w:t xml:space="preserve">PASS (3/3)</w:t>
+              <w:t xml:space="preserve">Sim DMN (DMN-1–3)</w:t>
+            </w:r>
+          </w:p>
+        </w:tc>
+        <w:tc>
+          <w:tcPr/>
+          <w:p>
+            <w:pPr>
+              <w:pStyle w:val="Compact"/>
+              <w:jc w:val="left"/>
+            </w:pPr>
+            <w:r>
+              <w:t xml:space="preserve">1,000 agents, K in [1..10]</w:t>
+            </w:r>
+          </w:p>
+        </w:tc>
+        <w:tc>
+          <w:tcPr/>
+          <w:p>
+            <w:pPr>
+              <w:pStyle w:val="Compact"/>
+              <w:jc w:val="left"/>
+            </w:pPr>
+            <w:r>
+              <w:t xml:space="preserve">FAIL / PASS / PASS</w:t>
             </w:r>
           </w:p>
         </w:tc>
@@ -1458,31 +1458,31 @@
               <w:jc w:val="left"/>
             </w:pPr>
             <w:r>
-              <w:t xml:space="preserve">Sim X (X1 / X2 / X3)</w:t>
-            </w:r>
-          </w:p>
-        </w:tc>
-        <w:tc>
-          <w:tcPr/>
-          <w:p>
-            <w:pPr>
-              <w:pStyle w:val="Compact"/>
-              <w:jc w:val="left"/>
-            </w:pPr>
-            <w:r>
-              <w:t xml:space="preserve">4 substrates, Cell to Human</w:t>
-            </w:r>
-          </w:p>
-        </w:tc>
-        <w:tc>
-          <w:tcPr/>
-          <w:p>
-            <w:pPr>
-              <w:pStyle w:val="Compact"/>
-              <w:jc w:val="left"/>
-            </w:pPr>
-            <w:r>
-              <w:t xml:space="preserve">PASS (3/3)</w:t>
+              <w:t xml:space="preserve">Sim CRIT (CRIT-1–3)</w:t>
+            </w:r>
+          </w:p>
+        </w:tc>
+        <w:tc>
+          <w:tcPr/>
+          <w:p>
+            <w:pPr>
+              <w:pStyle w:val="Compact"/>
+              <w:jc w:val="left"/>
+            </w:pPr>
+            <w:r>
+              <w:t xml:space="preserve">1,024 nodes, branching</w:t>
+            </w:r>
+          </w:p>
+        </w:tc>
+        <w:tc>
+          <w:tcPr/>
+          <w:p>
+            <w:pPr>
+              <w:pStyle w:val="Compact"/>
+              <w:jc w:val="left"/>
+            </w:pPr>
+            <w:r>
+              <w:t xml:space="preserve">FAIL / PASS / PASS</w:t>
             </w:r>
           </w:p>
         </w:tc>
@@ -1508,6 +1508,106 @@
               <w:jc w:val="left"/>
             </w:pPr>
             <w:r>
+              <w:t xml:space="preserve">Sim B (B1 / B2 / B3)</w:t>
+            </w:r>
+          </w:p>
+        </w:tc>
+        <w:tc>
+          <w:tcPr/>
+          <w:p>
+            <w:pPr>
+              <w:pStyle w:val="Compact"/>
+              <w:jc w:val="left"/>
+            </w:pPr>
+            <w:r>
+              <w:t xml:space="preserve">512 non-neural cells, maze</w:t>
+            </w:r>
+          </w:p>
+        </w:tc>
+        <w:tc>
+          <w:tcPr/>
+          <w:p>
+            <w:pPr>
+              <w:pStyle w:val="Compact"/>
+              <w:jc w:val="left"/>
+            </w:pPr>
+            <w:r>
+              <w:t xml:space="preserve">PASS (3/3)</w:t>
+            </w:r>
+          </w:p>
+        </w:tc>
+        <w:tc>
+          <w:tcPr/>
+          <w:p>
+            <w:pPr>
+              <w:pStyle w:val="Compact"/>
+              <w:jc w:val="left"/>
+            </w:pPr>
+            <w:r>
+              <w:t xml:space="preserve">DOCAS §5.25</w:t>
+            </w:r>
+          </w:p>
+        </w:tc>
+      </w:tr>
+      <w:tr>
+        <w:tc>
+          <w:tcPr/>
+          <w:p>
+            <w:pPr>
+              <w:pStyle w:val="Compact"/>
+              <w:jc w:val="left"/>
+            </w:pPr>
+            <w:r>
+              <w:t xml:space="preserve">Sim X (X1 / X2 / X3)</w:t>
+            </w:r>
+          </w:p>
+        </w:tc>
+        <w:tc>
+          <w:tcPr/>
+          <w:p>
+            <w:pPr>
+              <w:pStyle w:val="Compact"/>
+              <w:jc w:val="left"/>
+            </w:pPr>
+            <w:r>
+              <w:t xml:space="preserve">4 substrates, Cell to Human</w:t>
+            </w:r>
+          </w:p>
+        </w:tc>
+        <w:tc>
+          <w:tcPr/>
+          <w:p>
+            <w:pPr>
+              <w:pStyle w:val="Compact"/>
+              <w:jc w:val="left"/>
+            </w:pPr>
+            <w:r>
+              <w:t xml:space="preserve">PASS (3/3)</w:t>
+            </w:r>
+          </w:p>
+        </w:tc>
+        <w:tc>
+          <w:tcPr/>
+          <w:p>
+            <w:pPr>
+              <w:pStyle w:val="Compact"/>
+              <w:jc w:val="left"/>
+            </w:pPr>
+            <w:r>
+              <w:t xml:space="preserve">DOCAS §5.26</w:t>
+            </w:r>
+          </w:p>
+        </w:tc>
+      </w:tr>
+      <w:tr>
+        <w:tc>
+          <w:tcPr/>
+          <w:p>
+            <w:pPr>
+              <w:pStyle w:val="Compact"/>
+              <w:jc w:val="left"/>
+            </w:pPr>
+            <w:r>
               <w:t xml:space="preserve">Sim META (META-1–3)</w:t>
             </w:r>
           </w:p>
@@ -1544,7 +1644,7 @@
               <w:jc w:val="left"/>
             </w:pPr>
             <w:r>
-              <w:t xml:space="preserve">DOCAS §5.25</w:t>
+              <w:t xml:space="preserve">DOCAS §5.27</w:t>
             </w:r>
           </w:p>
         </w:tc>

</xml_diff>